<commit_message>
Add UA2 evaluation timetable (Wed-Fri 8h-12h)
Co-Authored-By: Claude Sonnet 5.5 <noreply@anthropic.com>
Claude-Session: https://claude.ai/code/session_01NZxYRpYCJka2jQFTHvmGQ5
</commit_message>
<xml_diff>
--- a/Emploi_du_Temps_Evaluation_Sequence2_UA2_BCBS.docx
+++ b/Emploi_du_Temps_Evaluation_Sequence2_UA2_BCBS.docx
@@ -2405,7 +2405,7 @@
     </w:p>
     <w:p>
       <w:pPr>
-        <w:spacing w:after="40" w:before="0"/>
+        <w:spacing w:after="0" w:before="0"/>
       </w:pPr>
       <w:r>
         <w:rPr>
@@ -2427,20 +2427,6 @@
           <w:szCs w:val="18"/>
         </w:rPr>
         <w:t xml:space="preserve">Les classes laissées vides sont à compléter par la Direction avec les matières de chaque classe.</w:t>
-      </w:r>
-    </w:p>
-    <w:p>
-      <w:pPr>
-        <w:spacing w:after="0" w:before="0"/>
-      </w:pPr>
-      <w:r>
-        <w:rPr>
-          <w:rFonts w:ascii="Arial" w:cs="Arial" w:eastAsia="Arial" w:hAnsi="Arial"/>
-          <w:color w:val="566860"/>
-          <w:sz w:val="18"/>
-          <w:szCs w:val="18"/>
-        </w:rPr>
-        <w:t xml:space="preserve">Rappels : les élèves arrivent 15 minutes avant le début de l’évaluation et doivent avoir leur matériel complet (stylo, crayon, gomme, règle).</w:t>
       </w:r>
     </w:p>
     <w:sectPr>

</xml_diff>